<commit_message>
Verbeterplan en documenten update
Gehele documenten herstructureren, Testplan tabel met totale uitleg.
</commit_message>
<xml_diff>
--- a/Documents/Plan van eisen - Messy Coder.docx
+++ b/Documents/Plan van eisen - Messy Coder.docx
@@ -1,10 +1,10 @@
 
 <file path=word/document.xml><?xml version="1.0" encoding="utf-8"?>
-<w:document xmlns:wpc="http://schemas.microsoft.com/office/word/2010/wordprocessingCanvas" xmlns:cx="http://schemas.microsoft.com/office/drawing/2014/chartex" xmlns:cx1="http://schemas.microsoft.com/office/drawing/2015/9/8/chartex" xmlns:cx2="http://schemas.microsoft.com/office/drawing/2015/10/21/chartex" xmlns:cx3="http://schemas.microsoft.com/office/drawing/2016/5/9/chartex" xmlns:cx4="http://schemas.microsoft.com/office/drawing/2016/5/10/chartex" xmlns:cx5="http://schemas.microsoft.com/office/drawing/2016/5/11/chartex" xmlns:cx6="http://schemas.microsoft.com/office/drawing/2016/5/12/chartex" xmlns:cx7="http://schemas.microsoft.com/office/drawing/2016/5/13/chartex" xmlns:cx8="http://schemas.microsoft.com/office/drawing/2016/5/14/chartex" xmlns:mc="http://schemas.openxmlformats.org/markup-compatibility/2006" xmlns:m="http://schemas.openxmlformats.org/officeDocument/2006/math" xmlns:aink="http://schemas.microsoft.com/office/drawing/2016/ink" xmlns:am3d="http://schemas.microsoft.com/office/drawing/2017/model3d" xmlns:oel="http://schemas.microsoft.com/office/2019/extlst" xmlns:r="http://schemas.openxmlformats.org/officeDocument/2006/relationships" xmlns:wp14="http://schemas.microsoft.com/office/word/2010/wordprocessingDrawing" xmlns:wp="http://schemas.openxmlformats.org/drawingml/2006/wordprocessingDrawing" xmlns:wpg="http://schemas.microsoft.com/office/word/2010/wordprocessingGroup" xmlns:wpi="http://schemas.microsoft.com/office/word/2010/wordprocessingInk" xmlns:wps="http://schemas.microsoft.com/office/word/2010/wordprocessingShape" xmlns:o="urn:schemas-microsoft-com:office:office" xmlns:v="urn:schemas-microsoft-com:vml" xmlns:w10="urn:schemas-microsoft-com:office:word" xmlns:w="http://schemas.openxmlformats.org/wordprocessingml/2006/main" xmlns:w14="http://schemas.microsoft.com/office/word/2010/wordml" xmlns:w15="http://schemas.microsoft.com/office/word/2012/wordml" xmlns:w16cex="http://schemas.microsoft.com/office/word/2018/wordml/cex" xmlns:w16cid="http://schemas.microsoft.com/office/word/2016/wordml/cid" xmlns:w16="http://schemas.microsoft.com/office/word/2018/wordml" xmlns:w16sdtdh="http://schemas.microsoft.com/office/word/2020/wordml/sdtdatahash" xmlns:w16sdtfl="http://schemas.microsoft.com/office/word/2024/wordml/sdtformatlock" xmlns:w16se="http://schemas.microsoft.com/office/word/2015/wordml/symex" xmlns:w16du="http://schemas.microsoft.com/office/word/2023/wordml/word16du" xmlns:wne="http://schemas.microsoft.com/office/word/2006/wordml" mc:Ignorable="w14 w15 w16se w16cid w16 w16cex w16sdtdh w16sdtfl w16du wp14">
+<w:document xmlns:wpc="http://schemas.microsoft.com/office/word/2010/wordprocessingCanvas" xmlns:cx="http://schemas.microsoft.com/office/drawing/2014/chartex" xmlns:cx1="http://schemas.microsoft.com/office/drawing/2015/9/8/chartex" xmlns:cx2="http://schemas.microsoft.com/office/drawing/2015/10/21/chartex" xmlns:cx3="http://schemas.microsoft.com/office/drawing/2016/5/9/chartex" xmlns:cx4="http://schemas.microsoft.com/office/drawing/2016/5/10/chartex" xmlns:cx5="http://schemas.microsoft.com/office/drawing/2016/5/11/chartex" xmlns:cx6="http://schemas.microsoft.com/office/drawing/2016/5/12/chartex" xmlns:cx7="http://schemas.microsoft.com/office/drawing/2016/5/13/chartex" xmlns:cx8="http://schemas.microsoft.com/office/drawing/2016/5/14/chartex" xmlns:mc="http://schemas.openxmlformats.org/markup-compatibility/2006" xmlns:aink="http://schemas.microsoft.com/office/drawing/2016/ink" xmlns:am3d="http://schemas.microsoft.com/office/drawing/2017/model3d" xmlns:o="urn:schemas-microsoft-com:office:office" xmlns:oel="http://schemas.microsoft.com/office/2019/extlst" xmlns:r="http://schemas.openxmlformats.org/officeDocument/2006/relationships" xmlns:m="http://schemas.openxmlformats.org/officeDocument/2006/math" xmlns:v="urn:schemas-microsoft-com:vml" xmlns:wp14="http://schemas.microsoft.com/office/word/2010/wordprocessingDrawing" xmlns:wp="http://schemas.openxmlformats.org/drawingml/2006/wordprocessingDrawing" xmlns:w10="urn:schemas-microsoft-com:office:word" xmlns:w="http://schemas.openxmlformats.org/wordprocessingml/2006/main" xmlns:w14="http://schemas.microsoft.com/office/word/2010/wordml" xmlns:w15="http://schemas.microsoft.com/office/word/2012/wordml" xmlns:w16cex="http://schemas.microsoft.com/office/word/2018/wordml/cex" xmlns:w16cid="http://schemas.microsoft.com/office/word/2016/wordml/cid" xmlns:w16="http://schemas.microsoft.com/office/word/2018/wordml" xmlns:w16du="http://schemas.microsoft.com/office/word/2023/wordml/word16du" xmlns:w16sdtdh="http://schemas.microsoft.com/office/word/2020/wordml/sdtdatahash" xmlns:w16sdtfl="http://schemas.microsoft.com/office/word/2024/wordml/sdtformatlock" xmlns:w16se="http://schemas.microsoft.com/office/word/2015/wordml/symex" xmlns:wpg="http://schemas.microsoft.com/office/word/2010/wordprocessingGroup" xmlns:wpi="http://schemas.microsoft.com/office/word/2010/wordprocessingInk" xmlns:wne="http://schemas.microsoft.com/office/word/2006/wordml" xmlns:wps="http://schemas.microsoft.com/office/word/2010/wordprocessingShape" mc:Ignorable="w14 w15 w16se w16cid w16 w16cex w16sdtdh w16sdtfl w16du wp14">
   <w:body>
     <w:p>
       <w:pPr>
-        <w:pStyle w:val="Titel"/>
+        <w:pStyle w:val="Title"/>
         <w:rPr>
           <w:rFonts w:asciiTheme="minorHAnsi" w:hAnsiTheme="minorHAnsi"/>
         </w:rPr>
@@ -25,7 +25,7 @@
     </w:p>
     <w:p>
       <w:pPr>
-        <w:pStyle w:val="Kop1"/>
+        <w:pStyle w:val="Heading1"/>
         <w:rPr>
           <w:rFonts w:asciiTheme="minorHAnsi" w:hAnsiTheme="minorHAnsi"/>
         </w:rPr>
@@ -59,7 +59,7 @@
     </w:p>
     <w:p>
       <w:pPr>
-        <w:pStyle w:val="Kop1"/>
+        <w:pStyle w:val="Heading1"/>
         <w:rPr>
           <w:rFonts w:asciiTheme="minorHAnsi" w:hAnsiTheme="minorHAnsi"/>
         </w:rPr>
@@ -93,7 +93,7 @@
     </w:p>
     <w:p>
       <w:pPr>
-        <w:pStyle w:val="Kop1"/>
+        <w:pStyle w:val="Heading1"/>
         <w:rPr>
           <w:rFonts w:asciiTheme="minorHAnsi" w:hAnsiTheme="minorHAnsi"/>
         </w:rPr>
@@ -107,10 +107,10 @@
     </w:p>
     <w:p>
       <w:pPr>
-        <w:pStyle w:val="Lijstalinea"/>
+        <w:pStyle w:val="ListParagraph"/>
         <w:numPr>
           <w:ilvl w:val="0"/>
-          <w:numId w:val="1"/>
+          <w:numId w:val="27"/>
         </w:numPr>
         <w:rPr>
           <w:rFonts w:asciiTheme="minorHAnsi" w:hAnsiTheme="minorHAnsi"/>
@@ -131,10 +131,10 @@
     </w:p>
     <w:p>
       <w:pPr>
-        <w:pStyle w:val="Lijstalinea"/>
+        <w:pStyle w:val="ListParagraph"/>
         <w:numPr>
           <w:ilvl w:val="0"/>
-          <w:numId w:val="1"/>
+          <w:numId w:val="27"/>
         </w:numPr>
         <w:rPr>
           <w:rFonts w:asciiTheme="minorHAnsi" w:hAnsiTheme="minorHAnsi"/>
@@ -149,10 +149,10 @@
     </w:p>
     <w:p>
       <w:pPr>
-        <w:pStyle w:val="Lijstalinea"/>
+        <w:pStyle w:val="ListParagraph"/>
         <w:numPr>
           <w:ilvl w:val="0"/>
-          <w:numId w:val="1"/>
+          <w:numId w:val="27"/>
         </w:numPr>
         <w:rPr>
           <w:rFonts w:asciiTheme="minorHAnsi" w:hAnsiTheme="minorHAnsi"/>
@@ -173,10 +173,10 @@
     </w:p>
     <w:p>
       <w:pPr>
-        <w:pStyle w:val="Lijstalinea"/>
+        <w:pStyle w:val="ListParagraph"/>
         <w:numPr>
           <w:ilvl w:val="0"/>
-          <w:numId w:val="1"/>
+          <w:numId w:val="27"/>
         </w:numPr>
         <w:rPr>
           <w:rFonts w:asciiTheme="minorHAnsi" w:hAnsiTheme="minorHAnsi"/>
@@ -186,15 +186,85 @@
         <w:rPr>
           <w:rFonts w:asciiTheme="minorHAnsi" w:hAnsiTheme="minorHAnsi"/>
         </w:rPr>
-        <w:t>Kerntaken bevat een lijst van van de kerntaken en werkprocessen. Elke werkproces kent een link waarin een lijst van bewijsmateriaal wordt getoond. Het bewijsmateriaal is geen link naar externe bronnen. Alles moet binnen het project worden opgeslagen. Het bewijsmateriaal kan diverse extenties hebben, minimaal wordt gedacht aan pdf, jpg, jpeg, png, mov, mp4, mp3. Deze lijst mag uitgebreid worden.</w:t>
-      </w:r>
-    </w:p>
-    <w:p>
-      <w:pPr>
-        <w:pStyle w:val="Lijstalinea"/>
+        <w:t xml:space="preserve">Kerntaken bevat een lijst van </w:t>
+      </w:r>
+      <w:proofErr w:type="spellStart"/>
+      <w:r>
+        <w:rPr>
+          <w:rFonts w:asciiTheme="minorHAnsi" w:hAnsiTheme="minorHAnsi"/>
+        </w:rPr>
+        <w:t>van</w:t>
+      </w:r>
+      <w:proofErr w:type="spellEnd"/>
+      <w:r>
+        <w:rPr>
+          <w:rFonts w:asciiTheme="minorHAnsi" w:hAnsiTheme="minorHAnsi"/>
+        </w:rPr>
+        <w:t xml:space="preserve"> de kerntaken en werkprocessen. Elke werkproces kent een link waarin een lijst van bewijsmateriaal wordt getoond. Het bewijsmateriaal is geen link naar externe bronnen. Alles moet binnen het project worden opgeslagen. Het bewijsmateriaal kan diverse </w:t>
+      </w:r>
+      <w:proofErr w:type="spellStart"/>
+      <w:r>
+        <w:rPr>
+          <w:rFonts w:asciiTheme="minorHAnsi" w:hAnsiTheme="minorHAnsi"/>
+        </w:rPr>
+        <w:t>extenties</w:t>
+      </w:r>
+      <w:proofErr w:type="spellEnd"/>
+      <w:r>
+        <w:rPr>
+          <w:rFonts w:asciiTheme="minorHAnsi" w:hAnsiTheme="minorHAnsi"/>
+        </w:rPr>
+        <w:t xml:space="preserve"> hebben, minimaal wordt gedacht aan pdf, jpg, </w:t>
+      </w:r>
+      <w:proofErr w:type="spellStart"/>
+      <w:r>
+        <w:rPr>
+          <w:rFonts w:asciiTheme="minorHAnsi" w:hAnsiTheme="minorHAnsi"/>
+        </w:rPr>
+        <w:t>jpeg</w:t>
+      </w:r>
+      <w:proofErr w:type="spellEnd"/>
+      <w:r>
+        <w:rPr>
+          <w:rFonts w:asciiTheme="minorHAnsi" w:hAnsiTheme="minorHAnsi"/>
+        </w:rPr>
+        <w:t xml:space="preserve">, </w:t>
+      </w:r>
+      <w:proofErr w:type="spellStart"/>
+      <w:r>
+        <w:rPr>
+          <w:rFonts w:asciiTheme="minorHAnsi" w:hAnsiTheme="minorHAnsi"/>
+        </w:rPr>
+        <w:t>png</w:t>
+      </w:r>
+      <w:proofErr w:type="spellEnd"/>
+      <w:r>
+        <w:rPr>
+          <w:rFonts w:asciiTheme="minorHAnsi" w:hAnsiTheme="minorHAnsi"/>
+        </w:rPr>
+        <w:t xml:space="preserve">, </w:t>
+      </w:r>
+      <w:proofErr w:type="spellStart"/>
+      <w:r>
+        <w:rPr>
+          <w:rFonts w:asciiTheme="minorHAnsi" w:hAnsiTheme="minorHAnsi"/>
+        </w:rPr>
+        <w:t>mov</w:t>
+      </w:r>
+      <w:proofErr w:type="spellEnd"/>
+      <w:r>
+        <w:rPr>
+          <w:rFonts w:asciiTheme="minorHAnsi" w:hAnsiTheme="minorHAnsi"/>
+        </w:rPr>
+        <w:t>, mp4, mp3. Deze lijst mag uitgebreid worden.</w:t>
+      </w:r>
+    </w:p>
+    <w:p>
+      <w:pPr>
+        <w:pStyle w:val="ListParagraph"/>
         <w:numPr>
           <w:ilvl w:val="0"/>
-          <w:numId w:val="1"/>
+          <w:numId w:val="27"/>
         </w:numPr>
         <w:rPr>
           <w:rFonts w:asciiTheme="minorHAnsi" w:hAnsiTheme="minorHAnsi"/>
@@ -204,15 +274,43 @@
         <w:rPr>
           <w:rFonts w:asciiTheme="minorHAnsi" w:hAnsiTheme="minorHAnsi"/>
         </w:rPr>
-        <w:t xml:space="preserve">Contact bevat de contactgegevens van de student. Deze pagina bevat minimaal een e-mailadres, of een formulier waarin contact gezocht kan worden. Tevens mogen links naar LinkedIn, FaceBook, Instagram, TikTok of andere social media worden gegeven. </w:t>
-      </w:r>
-    </w:p>
-    <w:p>
-      <w:pPr>
-        <w:pStyle w:val="Lijstalinea"/>
+        <w:t xml:space="preserve">Contact bevat de contactgegevens van de student. Deze pagina bevat minimaal een e-mailadres, of een formulier waarin contact gezocht kan worden. Tevens mogen links naar LinkedIn, </w:t>
+      </w:r>
+      <w:proofErr w:type="spellStart"/>
+      <w:r>
+        <w:rPr>
+          <w:rFonts w:asciiTheme="minorHAnsi" w:hAnsiTheme="minorHAnsi"/>
+        </w:rPr>
+        <w:t>FaceBook</w:t>
+      </w:r>
+      <w:proofErr w:type="spellEnd"/>
+      <w:r>
+        <w:rPr>
+          <w:rFonts w:asciiTheme="minorHAnsi" w:hAnsiTheme="minorHAnsi"/>
+        </w:rPr>
+        <w:t xml:space="preserve">, Instagram, TikTok of andere </w:t>
+      </w:r>
+      <w:proofErr w:type="spellStart"/>
+      <w:r>
+        <w:rPr>
+          <w:rFonts w:asciiTheme="minorHAnsi" w:hAnsiTheme="minorHAnsi"/>
+        </w:rPr>
+        <w:t>social</w:t>
+      </w:r>
+      <w:proofErr w:type="spellEnd"/>
+      <w:r>
+        <w:rPr>
+          <w:rFonts w:asciiTheme="minorHAnsi" w:hAnsiTheme="minorHAnsi"/>
+        </w:rPr>
+        <w:t xml:space="preserve"> media worden gegeven. </w:t>
+      </w:r>
+    </w:p>
+    <w:p>
+      <w:pPr>
+        <w:pStyle w:val="ListParagraph"/>
         <w:numPr>
           <w:ilvl w:val="0"/>
-          <w:numId w:val="1"/>
+          <w:numId w:val="27"/>
         </w:numPr>
         <w:rPr>
           <w:rFonts w:asciiTheme="minorHAnsi" w:hAnsiTheme="minorHAnsi"/>
@@ -222,15 +320,29 @@
         <w:rPr>
           <w:rFonts w:asciiTheme="minorHAnsi" w:hAnsiTheme="minorHAnsi"/>
         </w:rPr>
-        <w:t>Inloggen per student. Elke student krijgt zijn eigen portfolio te zien. De student is tevens admin voor zijn eigen portfolio.</w:t>
-      </w:r>
-    </w:p>
-    <w:p>
-      <w:pPr>
-        <w:pStyle w:val="Lijstalinea"/>
+        <w:t xml:space="preserve">Inloggen per student. Elke student krijgt zijn eigen portfolio te zien. De student is tevens </w:t>
+      </w:r>
+      <w:proofErr w:type="spellStart"/>
+      <w:r>
+        <w:rPr>
+          <w:rFonts w:asciiTheme="minorHAnsi" w:hAnsiTheme="minorHAnsi"/>
+        </w:rPr>
+        <w:t>admin</w:t>
+      </w:r>
+      <w:proofErr w:type="spellEnd"/>
+      <w:r>
+        <w:rPr>
+          <w:rFonts w:asciiTheme="minorHAnsi" w:hAnsiTheme="minorHAnsi"/>
+        </w:rPr>
+        <w:t xml:space="preserve"> voor zijn eigen portfolio.</w:t>
+      </w:r>
+    </w:p>
+    <w:p>
+      <w:pPr>
+        <w:pStyle w:val="ListParagraph"/>
         <w:numPr>
           <w:ilvl w:val="0"/>
-          <w:numId w:val="1"/>
+          <w:numId w:val="27"/>
         </w:numPr>
         <w:rPr>
           <w:rFonts w:asciiTheme="minorHAnsi" w:hAnsiTheme="minorHAnsi"/>
@@ -245,10 +357,10 @@
     </w:p>
     <w:p>
       <w:pPr>
-        <w:pStyle w:val="Lijstalinea"/>
+        <w:pStyle w:val="ListParagraph"/>
         <w:numPr>
           <w:ilvl w:val="0"/>
-          <w:numId w:val="1"/>
+          <w:numId w:val="27"/>
         </w:numPr>
         <w:rPr>
           <w:rFonts w:asciiTheme="minorHAnsi" w:hAnsiTheme="minorHAnsi"/>
@@ -263,10 +375,10 @@
     </w:p>
     <w:p>
       <w:pPr>
-        <w:pStyle w:val="Lijstalinea"/>
+        <w:pStyle w:val="ListParagraph"/>
         <w:numPr>
           <w:ilvl w:val="0"/>
-          <w:numId w:val="1"/>
+          <w:numId w:val="27"/>
         </w:numPr>
         <w:rPr>
           <w:rFonts w:asciiTheme="minorHAnsi" w:hAnsiTheme="minorHAnsi"/>
@@ -288,7 +400,21 @@
         <w:rPr>
           <w:rFonts w:asciiTheme="minorHAnsi" w:hAnsiTheme="minorHAnsi"/>
         </w:rPr>
-        <w:t>look and feel</w:t>
+        <w:t xml:space="preserve">look </w:t>
+      </w:r>
+      <w:proofErr w:type="spellStart"/>
+      <w:r>
+        <w:rPr>
+          <w:rFonts w:asciiTheme="minorHAnsi" w:hAnsiTheme="minorHAnsi"/>
+        </w:rPr>
+        <w:t>and</w:t>
+      </w:r>
+      <w:proofErr w:type="spellEnd"/>
+      <w:r>
+        <w:rPr>
+          <w:rFonts w:asciiTheme="minorHAnsi" w:hAnsiTheme="minorHAnsi"/>
+        </w:rPr>
+        <w:t xml:space="preserve"> feel</w:t>
       </w:r>
       <w:r>
         <w:rPr>
@@ -305,10 +431,10 @@
     </w:p>
     <w:p>
       <w:pPr>
-        <w:pStyle w:val="Lijstalinea"/>
+        <w:pStyle w:val="ListParagraph"/>
         <w:numPr>
           <w:ilvl w:val="0"/>
-          <w:numId w:val="1"/>
+          <w:numId w:val="27"/>
         </w:numPr>
         <w:rPr>
           <w:rFonts w:asciiTheme="minorHAnsi" w:hAnsiTheme="minorHAnsi"/>
@@ -324,10 +450,10 @@
     </w:p>
     <w:p>
       <w:pPr>
-        <w:pStyle w:val="Lijstalinea"/>
+        <w:pStyle w:val="ListParagraph"/>
         <w:numPr>
           <w:ilvl w:val="0"/>
-          <w:numId w:val="1"/>
+          <w:numId w:val="27"/>
         </w:numPr>
         <w:rPr>
           <w:rFonts w:asciiTheme="minorHAnsi" w:hAnsiTheme="minorHAnsi"/>
@@ -342,10 +468,10 @@
     </w:p>
     <w:p>
       <w:pPr>
-        <w:pStyle w:val="Lijstalinea"/>
+        <w:pStyle w:val="ListParagraph"/>
         <w:numPr>
           <w:ilvl w:val="0"/>
-          <w:numId w:val="1"/>
+          <w:numId w:val="27"/>
         </w:numPr>
         <w:rPr>
           <w:rFonts w:asciiTheme="minorHAnsi" w:hAnsiTheme="minorHAnsi"/>
@@ -360,10 +486,10 @@
     </w:p>
     <w:p>
       <w:pPr>
-        <w:pStyle w:val="Lijstalinea"/>
+        <w:pStyle w:val="ListParagraph"/>
         <w:numPr>
           <w:ilvl w:val="0"/>
-          <w:numId w:val="1"/>
+          <w:numId w:val="27"/>
         </w:numPr>
         <w:rPr>
           <w:rFonts w:asciiTheme="minorHAnsi" w:hAnsiTheme="minorHAnsi"/>
@@ -378,10 +504,10 @@
     </w:p>
     <w:p>
       <w:pPr>
-        <w:pStyle w:val="Lijstalinea"/>
+        <w:pStyle w:val="ListParagraph"/>
         <w:numPr>
           <w:ilvl w:val="0"/>
-          <w:numId w:val="1"/>
+          <w:numId w:val="27"/>
         </w:numPr>
         <w:rPr>
           <w:rFonts w:asciiTheme="minorHAnsi" w:hAnsiTheme="minorHAnsi"/>
@@ -391,15 +517,29 @@
         <w:rPr>
           <w:rFonts w:asciiTheme="minorHAnsi" w:hAnsiTheme="minorHAnsi"/>
         </w:rPr>
-        <w:t>De applicatie moet gebruikt kunnen worden door meerdere studenten. Elke student krijgt alleen zijn eigen projecten en zijn eigen bewijslast te zien. Teven kan elke student zijn eigen ‘look and feel’ aanpassen en wordt dit door de applicatie onthouden.</w:t>
-      </w:r>
-    </w:p>
-    <w:p>
-      <w:pPr>
-        <w:pStyle w:val="Lijstalinea"/>
+        <w:t xml:space="preserve">De applicatie moet gebruikt kunnen worden door meerdere studenten. Elke student krijgt alleen zijn eigen projecten en zijn eigen bewijslast te zien. Teven kan elke student zijn eigen ‘look </w:t>
+      </w:r>
+      <w:proofErr w:type="spellStart"/>
+      <w:r>
+        <w:rPr>
+          <w:rFonts w:asciiTheme="minorHAnsi" w:hAnsiTheme="minorHAnsi"/>
+        </w:rPr>
+        <w:t>and</w:t>
+      </w:r>
+      <w:proofErr w:type="spellEnd"/>
+      <w:r>
+        <w:rPr>
+          <w:rFonts w:asciiTheme="minorHAnsi" w:hAnsiTheme="minorHAnsi"/>
+        </w:rPr>
+        <w:t xml:space="preserve"> feel’ aanpassen en wordt dit door de applicatie onthouden.</w:t>
+      </w:r>
+    </w:p>
+    <w:p>
+      <w:pPr>
+        <w:pStyle w:val="ListParagraph"/>
         <w:numPr>
           <w:ilvl w:val="0"/>
-          <w:numId w:val="1"/>
+          <w:numId w:val="27"/>
         </w:numPr>
         <w:rPr>
           <w:rFonts w:asciiTheme="minorHAnsi" w:hAnsiTheme="minorHAnsi"/>
@@ -414,7 +554,7 @@
     </w:p>
     <w:p>
       <w:pPr>
-        <w:pStyle w:val="Kop1"/>
+        <w:pStyle w:val="Heading1"/>
         <w:rPr>
           <w:rFonts w:asciiTheme="minorHAnsi" w:hAnsiTheme="minorHAnsi"/>
         </w:rPr>
@@ -461,12 +601,17 @@
     </w:p>
     <w:p>
       <w:pPr>
-        <w:pStyle w:val="Titel"/>
+        <w:pStyle w:val="Title"/>
       </w:pPr>
       <w:r>
         <w:lastRenderedPageBreak/>
-        <w:t>User Stories</w:t>
-      </w:r>
+        <w:t xml:space="preserve">User </w:t>
+      </w:r>
+      <w:proofErr w:type="spellStart"/>
+      <w:r>
+        <w:t>Stories</w:t>
+      </w:r>
+      <w:proofErr w:type="spellEnd"/>
     </w:p>
     <w:p>
       <w:pPr>
@@ -488,6 +633,7 @@
           <w:szCs w:val="48"/>
         </w:rPr>
       </w:pPr>
+      <w:proofErr w:type="spellStart"/>
       <w:r>
         <w:rPr>
           <w:rFonts w:asciiTheme="minorHAnsi" w:hAnsiTheme="minorHAnsi"/>
@@ -497,7 +643,19 @@
           <w:sz w:val="48"/>
           <w:szCs w:val="48"/>
         </w:rPr>
-        <w:t>Epic 1 – Portfolio bekijken</w:t>
+        <w:t>Epic</w:t>
+      </w:r>
+      <w:proofErr w:type="spellEnd"/>
+      <w:r>
+        <w:rPr>
+          <w:rFonts w:asciiTheme="minorHAnsi" w:hAnsiTheme="minorHAnsi"/>
+          <w:b/>
+          <w:bCs/>
+          <w:kern w:val="36"/>
+          <w:sz w:val="48"/>
+          <w:szCs w:val="48"/>
+        </w:rPr>
+        <w:t xml:space="preserve"> 1 – Portfolio bekijken</w:t>
       </w:r>
     </w:p>
     <w:p>
@@ -668,7 +826,7 @@
           <w14:ligatures w14:val="standardContextual"/>
         </w:rPr>
         <w:pict w14:anchorId="58F2E41C">
-          <v:rect id="_x0000_i1048" alt="" style="width:453.6pt;height:.05pt;mso-width-percent:0;mso-height-percent:0;mso-width-percent:0;mso-height-percent:0" o:hralign="center" o:hrstd="t" o:hr="t" fillcolor="#a0a0a0" stroked="f"/>
+          <v:rect id="_x0000_i1025" alt="" style="width:453.6pt;height:.05pt;mso-width-percent:0;mso-height-percent:0;mso-width-percent:0;mso-height-percent:0" o:hralign="center" o:hrstd="t" o:hr="t" fillcolor="#a0a0a0" stroked="f"/>
         </w:pict>
       </w:r>
     </w:p>
@@ -840,7 +998,7 @@
           <w14:ligatures w14:val="standardContextual"/>
         </w:rPr>
         <w:pict w14:anchorId="77A564DB">
-          <v:rect id="_x0000_i1047" alt="" style="width:453.6pt;height:.05pt;mso-width-percent:0;mso-height-percent:0;mso-width-percent:0;mso-height-percent:0" o:hralign="center" o:hrstd="t" o:hr="t" fillcolor="#a0a0a0" stroked="f"/>
+          <v:rect id="_x0000_i1026" alt="" style="width:453.6pt;height:.05pt;mso-width-percent:0;mso-height-percent:0;mso-width-percent:0;mso-height-percent:0" o:hralign="center" o:hrstd="t" o:hr="t" fillcolor="#a0a0a0" stroked="f"/>
         </w:pict>
       </w:r>
     </w:p>
@@ -1013,7 +1171,7 @@
         </w:rPr>
         <w:lastRenderedPageBreak/>
         <w:pict w14:anchorId="56D5B08D">
-          <v:rect id="_x0000_i1046" alt="" style="width:453.6pt;height:.05pt;mso-width-percent:0;mso-height-percent:0;mso-width-percent:0;mso-height-percent:0" o:hralign="center" o:hrstd="t" o:hr="t" fillcolor="#a0a0a0" stroked="f"/>
+          <v:rect id="_x0000_i1027" alt="" style="width:453.6pt;height:.05pt;mso-width-percent:0;mso-height-percent:0;mso-width-percent:0;mso-height-percent:0" o:hralign="center" o:hrstd="t" o:hr="t" fillcolor="#a0a0a0" stroked="f"/>
         </w:pict>
       </w:r>
     </w:p>
@@ -1185,7 +1343,7 @@
           <w14:ligatures w14:val="standardContextual"/>
         </w:rPr>
         <w:pict w14:anchorId="70688A7D">
-          <v:rect id="_x0000_i1045" alt="" style="width:453.6pt;height:.05pt;mso-width-percent:0;mso-height-percent:0;mso-width-percent:0;mso-height-percent:0" o:hralign="center" o:hrstd="t" o:hr="t" fillcolor="#a0a0a0" stroked="f"/>
+          <v:rect id="_x0000_i1028" alt="" style="width:453.6pt;height:.05pt;mso-width-percent:0;mso-height-percent:0;mso-width-percent:0;mso-height-percent:0" o:hralign="center" o:hrstd="t" o:hr="t" fillcolor="#a0a0a0" stroked="f"/>
         </w:pict>
       </w:r>
     </w:p>
@@ -1357,7 +1515,7 @@
           <w14:ligatures w14:val="standardContextual"/>
         </w:rPr>
         <w:pict w14:anchorId="18D1DD4B">
-          <v:rect id="_x0000_i1044" alt="" style="width:453.6pt;height:.05pt;mso-width-percent:0;mso-height-percent:0;mso-width-percent:0;mso-height-percent:0" o:hralign="center" o:hrstd="t" o:hr="t" fillcolor="#a0a0a0" stroked="f"/>
+          <v:rect id="_x0000_i1029" alt="" style="width:453.6pt;height:.05pt;mso-width-percent:0;mso-height-percent:0;mso-width-percent:0;mso-height-percent:0" o:hralign="center" o:hrstd="t" o:hr="t" fillcolor="#a0a0a0" stroked="f"/>
         </w:pict>
       </w:r>
     </w:p>
@@ -1638,7 +1796,7 @@
         </w:rPr>
         <w:lastRenderedPageBreak/>
         <w:pict w14:anchorId="6A0170D5">
-          <v:rect id="_x0000_i1043" alt="" style="width:453.6pt;height:.05pt;mso-width-percent:0;mso-height-percent:0;mso-width-percent:0;mso-height-percent:0" o:hralign="center" o:hrstd="t" o:hr="t" fillcolor="#a0a0a0" stroked="f"/>
+          <v:rect id="_x0000_i1030" alt="" style="width:453.6pt;height:.05pt;mso-width-percent:0;mso-height-percent:0;mso-width-percent:0;mso-height-percent:0" o:hralign="center" o:hrstd="t" o:hr="t" fillcolor="#a0a0a0" stroked="f"/>
         </w:pict>
       </w:r>
     </w:p>
@@ -1772,11 +1930,19 @@
           <w:rFonts w:asciiTheme="minorHAnsi" w:hAnsiTheme="minorHAnsi"/>
         </w:rPr>
       </w:pPr>
-      <w:r>
-        <w:rPr>
-          <w:rFonts w:asciiTheme="minorHAnsi" w:hAnsiTheme="minorHAnsi"/>
-        </w:rPr>
-        <w:t>Social media links kunnen worden weergegeven.</w:t>
+      <w:proofErr w:type="spellStart"/>
+      <w:r>
+        <w:rPr>
+          <w:rFonts w:asciiTheme="minorHAnsi" w:hAnsiTheme="minorHAnsi"/>
+        </w:rPr>
+        <w:t>Social</w:t>
+      </w:r>
+      <w:proofErr w:type="spellEnd"/>
+      <w:r>
+        <w:rPr>
+          <w:rFonts w:asciiTheme="minorHAnsi" w:hAnsiTheme="minorHAnsi"/>
+        </w:rPr>
+        <w:t xml:space="preserve"> media links kunnen worden weergegeven.</w:t>
       </w:r>
     </w:p>
     <w:p>
@@ -1792,7 +1958,7 @@
           <w14:ligatures w14:val="standardContextual"/>
         </w:rPr>
         <w:pict w14:anchorId="2DF48152">
-          <v:rect id="_x0000_i1042" alt="" style="width:453.6pt;height:.05pt;mso-width-percent:0;mso-height-percent:0;mso-width-percent:0;mso-height-percent:0" o:hralign="center" o:hrstd="t" o:hr="t" fillcolor="#a0a0a0" stroked="f"/>
+          <v:rect id="_x0000_i1031" alt="" style="width:453.6pt;height:.05pt;mso-width-percent:0;mso-height-percent:0;mso-width-percent:0;mso-height-percent:0" o:hralign="center" o:hrstd="t" o:hr="t" fillcolor="#a0a0a0" stroked="f"/>
         </w:pict>
       </w:r>
     </w:p>
@@ -1809,6 +1975,7 @@
           <w:szCs w:val="48"/>
         </w:rPr>
       </w:pPr>
+      <w:proofErr w:type="spellStart"/>
       <w:r>
         <w:rPr>
           <w:rFonts w:asciiTheme="minorHAnsi" w:hAnsiTheme="minorHAnsi"/>
@@ -1818,7 +1985,19 @@
           <w:sz w:val="48"/>
           <w:szCs w:val="48"/>
         </w:rPr>
-        <w:t>Epic 2 – Authenticatie</w:t>
+        <w:t>Epic</w:t>
+      </w:r>
+      <w:proofErr w:type="spellEnd"/>
+      <w:r>
+        <w:rPr>
+          <w:rFonts w:asciiTheme="minorHAnsi" w:hAnsiTheme="minorHAnsi"/>
+          <w:b/>
+          <w:bCs/>
+          <w:kern w:val="36"/>
+          <w:sz w:val="48"/>
+          <w:szCs w:val="48"/>
+        </w:rPr>
+        <w:t xml:space="preserve"> 2 – Authenticatie</w:t>
       </w:r>
     </w:p>
     <w:p>
@@ -1989,7 +2168,7 @@
           <w14:ligatures w14:val="standardContextual"/>
         </w:rPr>
         <w:pict w14:anchorId="24198FDA">
-          <v:rect id="_x0000_i1041" alt="" style="width:453.6pt;height:.05pt;mso-width-percent:0;mso-height-percent:0;mso-width-percent:0;mso-height-percent:0" o:hralign="center" o:hrstd="t" o:hr="t" fillcolor="#a0a0a0" stroked="f"/>
+          <v:rect id="_x0000_i1032" alt="" style="width:453.6pt;height:.05pt;mso-width-percent:0;mso-height-percent:0;mso-width-percent:0;mso-height-percent:0" o:hralign="center" o:hrstd="t" o:hr="t" fillcolor="#a0a0a0" stroked="f"/>
         </w:pict>
       </w:r>
     </w:p>
@@ -2143,7 +2322,7 @@
           <w14:ligatures w14:val="standardContextual"/>
         </w:rPr>
         <w:pict w14:anchorId="59CC2FB8">
-          <v:rect id="_x0000_i1040" alt="" style="width:453.6pt;height:.05pt;mso-width-percent:0;mso-height-percent:0;mso-width-percent:0;mso-height-percent:0" o:hralign="center" o:hrstd="t" o:hr="t" fillcolor="#a0a0a0" stroked="f"/>
+          <v:rect id="_x0000_i1033" alt="" style="width:453.6pt;height:.05pt;mso-width-percent:0;mso-height-percent:0;mso-width-percent:0;mso-height-percent:0" o:hralign="center" o:hrstd="t" o:hr="t" fillcolor="#a0a0a0" stroked="f"/>
         </w:pict>
       </w:r>
     </w:p>
@@ -2298,7 +2477,7 @@
           <w14:ligatures w14:val="standardContextual"/>
         </w:rPr>
         <w:pict w14:anchorId="7A6052B5">
-          <v:rect id="_x0000_i1039" alt="" style="width:453.6pt;height:.05pt;mso-width-percent:0;mso-height-percent:0;mso-width-percent:0;mso-height-percent:0" o:hralign="center" o:hrstd="t" o:hr="t" fillcolor="#a0a0a0" stroked="f"/>
+          <v:rect id="_x0000_i1034" alt="" style="width:453.6pt;height:.05pt;mso-width-percent:0;mso-height-percent:0;mso-width-percent:0;mso-height-percent:0" o:hralign="center" o:hrstd="t" o:hr="t" fillcolor="#a0a0a0" stroked="f"/>
         </w:pict>
       </w:r>
     </w:p>
@@ -2452,7 +2631,7 @@
           <w14:ligatures w14:val="standardContextual"/>
         </w:rPr>
         <w:pict w14:anchorId="120B0687">
-          <v:rect id="_x0000_i1038" alt="" style="width:453.6pt;height:.05pt;mso-width-percent:0;mso-height-percent:0;mso-width-percent:0;mso-height-percent:0" o:hralign="center" o:hrstd="t" o:hr="t" fillcolor="#a0a0a0" stroked="f"/>
+          <v:rect id="_x0000_i1035" alt="" style="width:453.6pt;height:.05pt;mso-width-percent:0;mso-height-percent:0;mso-width-percent:0;mso-height-percent:0" o:hralign="center" o:hrstd="t" o:hr="t" fillcolor="#a0a0a0" stroked="f"/>
         </w:pict>
       </w:r>
     </w:p>
@@ -2606,7 +2785,7 @@
           <w14:ligatures w14:val="standardContextual"/>
         </w:rPr>
         <w:pict w14:anchorId="1FED9C2B">
-          <v:rect id="_x0000_i1037" alt="" style="width:453.6pt;height:.05pt;mso-width-percent:0;mso-height-percent:0;mso-width-percent:0;mso-height-percent:0" o:hralign="center" o:hrstd="t" o:hr="t" fillcolor="#a0a0a0" stroked="f"/>
+          <v:rect id="_x0000_i1036" alt="" style="width:453.6pt;height:.05pt;mso-width-percent:0;mso-height-percent:0;mso-width-percent:0;mso-height-percent:0" o:hralign="center" o:hrstd="t" o:hr="t" fillcolor="#a0a0a0" stroked="f"/>
         </w:pict>
       </w:r>
     </w:p>
@@ -2623,6 +2802,7 @@
           <w:szCs w:val="48"/>
         </w:rPr>
       </w:pPr>
+      <w:proofErr w:type="spellStart"/>
       <w:r>
         <w:rPr>
           <w:rFonts w:asciiTheme="minorHAnsi" w:hAnsiTheme="minorHAnsi"/>
@@ -2632,7 +2812,19 @@
           <w:sz w:val="48"/>
           <w:szCs w:val="48"/>
         </w:rPr>
-        <w:t>Epic 3 – Portfolio beheren</w:t>
+        <w:t>Epic</w:t>
+      </w:r>
+      <w:proofErr w:type="spellEnd"/>
+      <w:r>
+        <w:rPr>
+          <w:rFonts w:asciiTheme="minorHAnsi" w:hAnsiTheme="minorHAnsi"/>
+          <w:b/>
+          <w:bCs/>
+          <w:kern w:val="36"/>
+          <w:sz w:val="48"/>
+          <w:szCs w:val="48"/>
+        </w:rPr>
+        <w:t xml:space="preserve"> 3 – Portfolio beheren</w:t>
       </w:r>
     </w:p>
     <w:p>
@@ -2804,7 +2996,7 @@
           <w14:ligatures w14:val="standardContextual"/>
         </w:rPr>
         <w:pict w14:anchorId="030992FC">
-          <v:rect id="_x0000_i1036" alt="" style="width:453.6pt;height:.05pt;mso-width-percent:0;mso-height-percent:0;mso-width-percent:0;mso-height-percent:0" o:hralign="center" o:hrstd="t" o:hr="t" fillcolor="#a0a0a0" stroked="f"/>
+          <v:rect id="_x0000_i1037" alt="" style="width:453.6pt;height:.05pt;mso-width-percent:0;mso-height-percent:0;mso-width-percent:0;mso-height-percent:0" o:hralign="center" o:hrstd="t" o:hr="t" fillcolor="#a0a0a0" stroked="f"/>
         </w:pict>
       </w:r>
     </w:p>
@@ -2976,7 +3168,7 @@
           <w14:ligatures w14:val="standardContextual"/>
         </w:rPr>
         <w:pict w14:anchorId="3C87AFFC">
-          <v:rect id="_x0000_i1035" alt="" style="width:453.6pt;height:.05pt;mso-width-percent:0;mso-height-percent:0;mso-width-percent:0;mso-height-percent:0" o:hralign="center" o:hrstd="t" o:hr="t" fillcolor="#a0a0a0" stroked="f"/>
+          <v:rect id="_x0000_i1038" alt="" style="width:453.6pt;height:.05pt;mso-width-percent:0;mso-height-percent:0;mso-width-percent:0;mso-height-percent:0" o:hralign="center" o:hrstd="t" o:hr="t" fillcolor="#a0a0a0" stroked="f"/>
         </w:pict>
       </w:r>
     </w:p>
@@ -3130,7 +3322,7 @@
           <w14:ligatures w14:val="standardContextual"/>
         </w:rPr>
         <w:pict w14:anchorId="3D91BEB6">
-          <v:rect id="_x0000_i1034" alt="" style="width:453.6pt;height:.05pt;mso-width-percent:0;mso-height-percent:0;mso-width-percent:0;mso-height-percent:0" o:hralign="center" o:hrstd="t" o:hr="t" fillcolor="#a0a0a0" stroked="f"/>
+          <v:rect id="_x0000_i1039" alt="" style="width:453.6pt;height:.05pt;mso-width-percent:0;mso-height-percent:0;mso-width-percent:0;mso-height-percent:0" o:hralign="center" o:hrstd="t" o:hr="t" fillcolor="#a0a0a0" stroked="f"/>
         </w:pict>
       </w:r>
     </w:p>
@@ -3284,7 +3476,7 @@
           <w14:ligatures w14:val="standardContextual"/>
         </w:rPr>
         <w:pict w14:anchorId="435BB591">
-          <v:rect id="_x0000_i1033" alt="" style="width:453.6pt;height:.05pt;mso-width-percent:0;mso-height-percent:0;mso-width-percent:0;mso-height-percent:0" o:hralign="center" o:hrstd="t" o:hr="t" fillcolor="#a0a0a0" stroked="f"/>
+          <v:rect id="_x0000_i1040" alt="" style="width:453.6pt;height:.05pt;mso-width-percent:0;mso-height-percent:0;mso-width-percent:0;mso-height-percent:0" o:hralign="center" o:hrstd="t" o:hr="t" fillcolor="#a0a0a0" stroked="f"/>
         </w:pict>
       </w:r>
     </w:p>
@@ -3439,7 +3631,7 @@
           <w14:ligatures w14:val="standardContextual"/>
         </w:rPr>
         <w:pict w14:anchorId="7ED4040D">
-          <v:rect id="_x0000_i1032" alt="" style="width:453.6pt;height:.05pt;mso-width-percent:0;mso-height-percent:0;mso-width-percent:0;mso-height-percent:0" o:hralign="center" o:hrstd="t" o:hr="t" fillcolor="#a0a0a0" stroked="f"/>
+          <v:rect id="_x0000_i1041" alt="" style="width:453.6pt;height:.05pt;mso-width-percent:0;mso-height-percent:0;mso-width-percent:0;mso-height-percent:0" o:hralign="center" o:hrstd="t" o:hr="t" fillcolor="#a0a0a0" stroked="f"/>
         </w:pict>
       </w:r>
     </w:p>
@@ -3593,7 +3785,7 @@
           <w14:ligatures w14:val="standardContextual"/>
         </w:rPr>
         <w:pict w14:anchorId="004BD3D4">
-          <v:rect id="_x0000_i1031" alt="" style="width:453.6pt;height:.05pt;mso-width-percent:0;mso-height-percent:0;mso-width-percent:0;mso-height-percent:0" o:hralign="center" o:hrstd="t" o:hr="t" fillcolor="#a0a0a0" stroked="f"/>
+          <v:rect id="_x0000_i1042" alt="" style="width:453.6pt;height:.05pt;mso-width-percent:0;mso-height-percent:0;mso-width-percent:0;mso-height-percent:0" o:hralign="center" o:hrstd="t" o:hr="t" fillcolor="#a0a0a0" stroked="f"/>
         </w:pict>
       </w:r>
     </w:p>
@@ -3765,7 +3957,7 @@
           <w14:ligatures w14:val="standardContextual"/>
         </w:rPr>
         <w:pict w14:anchorId="3ED3889E">
-          <v:rect id="_x0000_i1030" alt="" style="width:453.6pt;height:.05pt;mso-width-percent:0;mso-height-percent:0;mso-width-percent:0;mso-height-percent:0" o:hralign="center" o:hrstd="t" o:hr="t" fillcolor="#a0a0a0" stroked="f"/>
+          <v:rect id="_x0000_i1043" alt="" style="width:453.6pt;height:.05pt;mso-width-percent:0;mso-height-percent:0;mso-width-percent:0;mso-height-percent:0" o:hralign="center" o:hrstd="t" o:hr="t" fillcolor="#a0a0a0" stroked="f"/>
         </w:pict>
       </w:r>
     </w:p>
@@ -3782,6 +3974,7 @@
           <w:szCs w:val="48"/>
         </w:rPr>
       </w:pPr>
+      <w:proofErr w:type="spellStart"/>
       <w:r>
         <w:rPr>
           <w:rFonts w:asciiTheme="minorHAnsi" w:hAnsiTheme="minorHAnsi"/>
@@ -3791,7 +3984,19 @@
           <w:sz w:val="48"/>
           <w:szCs w:val="48"/>
         </w:rPr>
-        <w:t>Epic 4 – Portfolio beoordelen</w:t>
+        <w:t>Epic</w:t>
+      </w:r>
+      <w:proofErr w:type="spellEnd"/>
+      <w:r>
+        <w:rPr>
+          <w:rFonts w:asciiTheme="minorHAnsi" w:hAnsiTheme="minorHAnsi"/>
+          <w:b/>
+          <w:bCs/>
+          <w:kern w:val="36"/>
+          <w:sz w:val="48"/>
+          <w:szCs w:val="48"/>
+        </w:rPr>
+        <w:t xml:space="preserve"> 4 – Portfolio beoordelen</w:t>
       </w:r>
     </w:p>
     <w:p>
@@ -3945,7 +4150,7 @@
           <w14:ligatures w14:val="standardContextual"/>
         </w:rPr>
         <w:pict w14:anchorId="4F3DA457">
-          <v:rect id="_x0000_i1029" alt="" style="width:453.6pt;height:.05pt;mso-width-percent:0;mso-height-percent:0;mso-width-percent:0;mso-height-percent:0" o:hralign="center" o:hrstd="t" o:hr="t" fillcolor="#a0a0a0" stroked="f"/>
+          <v:rect id="_x0000_i1044" alt="" style="width:453.6pt;height:.05pt;mso-width-percent:0;mso-height-percent:0;mso-width-percent:0;mso-height-percent:0" o:hralign="center" o:hrstd="t" o:hr="t" fillcolor="#a0a0a0" stroked="f"/>
         </w:pict>
       </w:r>
     </w:p>
@@ -4099,7 +4304,7 @@
           <w14:ligatures w14:val="standardContextual"/>
         </w:rPr>
         <w:pict w14:anchorId="12DF8AF1">
-          <v:rect id="_x0000_i1028" alt="" style="width:453.6pt;height:.05pt;mso-width-percent:0;mso-height-percent:0;mso-width-percent:0;mso-height-percent:0" o:hralign="center" o:hrstd="t" o:hr="t" fillcolor="#a0a0a0" stroked="f"/>
+          <v:rect id="_x0000_i1045" alt="" style="width:453.6pt;height:.05pt;mso-width-percent:0;mso-height-percent:0;mso-width-percent:0;mso-height-percent:0" o:hralign="center" o:hrstd="t" o:hr="t" fillcolor="#a0a0a0" stroked="f"/>
         </w:pict>
       </w:r>
     </w:p>
@@ -4116,6 +4321,7 @@
           <w:szCs w:val="48"/>
         </w:rPr>
       </w:pPr>
+      <w:proofErr w:type="spellStart"/>
       <w:r>
         <w:rPr>
           <w:rFonts w:asciiTheme="minorHAnsi" w:hAnsiTheme="minorHAnsi"/>
@@ -4125,7 +4331,19 @@
           <w:sz w:val="48"/>
           <w:szCs w:val="48"/>
         </w:rPr>
-        <w:t>Epic 5 – Gebruiksvriendelijkheid</w:t>
+        <w:t>Epic</w:t>
+      </w:r>
+      <w:proofErr w:type="spellEnd"/>
+      <w:r>
+        <w:rPr>
+          <w:rFonts w:asciiTheme="minorHAnsi" w:hAnsiTheme="minorHAnsi"/>
+          <w:b/>
+          <w:bCs/>
+          <w:kern w:val="36"/>
+          <w:sz w:val="48"/>
+          <w:szCs w:val="48"/>
+        </w:rPr>
+        <w:t xml:space="preserve"> 5 – Gebruiksvriendelijkheid</w:t>
       </w:r>
     </w:p>
     <w:p>
@@ -4296,7 +4514,7 @@
           <w14:ligatures w14:val="standardContextual"/>
         </w:rPr>
         <w:pict w14:anchorId="70262B13">
-          <v:rect id="_x0000_i1027" alt="" style="width:453.6pt;height:.05pt;mso-width-percent:0;mso-height-percent:0;mso-width-percent:0;mso-height-percent:0" o:hralign="center" o:hrstd="t" o:hr="t" fillcolor="#a0a0a0" stroked="f"/>
+          <v:rect id="_x0000_i1046" alt="" style="width:453.6pt;height:.05pt;mso-width-percent:0;mso-height-percent:0;mso-width-percent:0;mso-height-percent:0" o:hralign="center" o:hrstd="t" o:hr="t" fillcolor="#a0a0a0" stroked="f"/>
         </w:pict>
       </w:r>
     </w:p>
@@ -4320,7 +4538,29 @@
           <w:sz w:val="27"/>
           <w:szCs w:val="27"/>
         </w:rPr>
-        <w:t>US-23 – Responsive ontwerp</w:t>
+        <w:t xml:space="preserve">US-23 – </w:t>
+      </w:r>
+      <w:proofErr w:type="spellStart"/>
+      <w:r>
+        <w:rPr>
+          <w:rFonts w:asciiTheme="minorHAnsi" w:hAnsiTheme="minorHAnsi"/>
+          <w:b/>
+          <w:bCs/>
+          <w:sz w:val="27"/>
+          <w:szCs w:val="27"/>
+        </w:rPr>
+        <w:t>Responsive</w:t>
+      </w:r>
+      <w:proofErr w:type="spellEnd"/>
+      <w:r>
+        <w:rPr>
+          <w:rFonts w:asciiTheme="minorHAnsi" w:hAnsiTheme="minorHAnsi"/>
+          <w:b/>
+          <w:bCs/>
+          <w:sz w:val="27"/>
+          <w:szCs w:val="27"/>
+        </w:rPr>
+        <w:t xml:space="preserve"> ontwerp</w:t>
       </w:r>
     </w:p>
     <w:p>
@@ -4468,7 +4708,7 @@
           <w14:ligatures w14:val="standardContextual"/>
         </w:rPr>
         <w:pict w14:anchorId="167EE014">
-          <v:rect id="_x0000_i1026" alt="" style="width:453.6pt;height:.05pt;mso-width-percent:0;mso-height-percent:0;mso-width-percent:0;mso-height-percent:0" o:hralign="center" o:hrstd="t" o:hr="t" fillcolor="#a0a0a0" stroked="f"/>
+          <v:rect id="_x0000_i1047" alt="" style="width:453.6pt;height:.05pt;mso-width-percent:0;mso-height-percent:0;mso-width-percent:0;mso-height-percent:0" o:hralign="center" o:hrstd="t" o:hr="t" fillcolor="#a0a0a0" stroked="f"/>
         </w:pict>
       </w:r>
     </w:p>
@@ -4485,6 +4725,7 @@
           <w:szCs w:val="48"/>
         </w:rPr>
       </w:pPr>
+      <w:proofErr w:type="spellStart"/>
       <w:r>
         <w:rPr>
           <w:rFonts w:asciiTheme="minorHAnsi" w:hAnsiTheme="minorHAnsi"/>
@@ -4495,7 +4736,19 @@
           <w:szCs w:val="48"/>
         </w:rPr>
         <w:lastRenderedPageBreak/>
-        <w:t>Epic 6 – Multi-user ondersteuning</w:t>
+        <w:t>Epic</w:t>
+      </w:r>
+      <w:proofErr w:type="spellEnd"/>
+      <w:r>
+        <w:rPr>
+          <w:rFonts w:asciiTheme="minorHAnsi" w:hAnsiTheme="minorHAnsi"/>
+          <w:b/>
+          <w:bCs/>
+          <w:kern w:val="36"/>
+          <w:sz w:val="48"/>
+          <w:szCs w:val="48"/>
+        </w:rPr>
+        <w:t xml:space="preserve"> 6 – Multi-user ondersteuning</w:t>
       </w:r>
     </w:p>
     <w:p>
@@ -4648,7 +4901,7 @@
           <w14:ligatures w14:val="standardContextual"/>
         </w:rPr>
         <w:pict w14:anchorId="521E3F33">
-          <v:rect id="_x0000_i1025" alt="" style="width:453.6pt;height:.05pt;mso-width-percent:0;mso-height-percent:0;mso-width-percent:0;mso-height-percent:0" o:hralign="center" o:hrstd="t" o:hr="t" fillcolor="#a0a0a0" stroked="f"/>
+          <v:rect id="_x0000_i1048" alt="" style="width:453.6pt;height:.05pt;mso-width-percent:0;mso-height-percent:0;mso-width-percent:0;mso-height-percent:0" o:hralign="center" o:hrstd="t" o:hr="t" fillcolor="#a0a0a0" stroked="f"/>
         </w:pict>
       </w:r>
     </w:p>
@@ -4825,7 +5078,7 @@
 </file>
 
 <file path=word/numbering.xml><?xml version="1.0" encoding="utf-8"?>
-<w:numbering xmlns:wpc="http://schemas.microsoft.com/office/word/2010/wordprocessingCanvas" xmlns:cx="http://schemas.microsoft.com/office/drawing/2014/chartex" xmlns:cx1="http://schemas.microsoft.com/office/drawing/2015/9/8/chartex" xmlns:cx2="http://schemas.microsoft.com/office/drawing/2015/10/21/chartex" xmlns:cx3="http://schemas.microsoft.com/office/drawing/2016/5/9/chartex" xmlns:cx4="http://schemas.microsoft.com/office/drawing/2016/5/10/chartex" xmlns:cx5="http://schemas.microsoft.com/office/drawing/2016/5/11/chartex" xmlns:cx6="http://schemas.microsoft.com/office/drawing/2016/5/12/chartex" xmlns:cx7="http://schemas.microsoft.com/office/drawing/2016/5/13/chartex" xmlns:cx8="http://schemas.microsoft.com/office/drawing/2016/5/14/chartex" xmlns:mc="http://schemas.openxmlformats.org/markup-compatibility/2006" xmlns:m="http://schemas.openxmlformats.org/officeDocument/2006/math" xmlns:aink="http://schemas.microsoft.com/office/drawing/2016/ink" xmlns:am3d="http://schemas.microsoft.com/office/drawing/2017/model3d" xmlns:oel="http://schemas.microsoft.com/office/2019/extlst" xmlns:r="http://schemas.openxmlformats.org/officeDocument/2006/relationships" xmlns:wp14="http://schemas.microsoft.com/office/word/2010/wordprocessingDrawing" xmlns:wp="http://schemas.openxmlformats.org/drawingml/2006/wordprocessingDrawing" xmlns:wpg="http://schemas.microsoft.com/office/word/2010/wordprocessingGroup" xmlns:wpi="http://schemas.microsoft.com/office/word/2010/wordprocessingInk" xmlns:wps="http://schemas.microsoft.com/office/word/2010/wordprocessingShape" xmlns:o="urn:schemas-microsoft-com:office:office" xmlns:v="urn:schemas-microsoft-com:vml" xmlns:w10="urn:schemas-microsoft-com:office:word" xmlns:w="http://schemas.openxmlformats.org/wordprocessingml/2006/main" xmlns:w14="http://schemas.microsoft.com/office/word/2010/wordml" xmlns:w15="http://schemas.microsoft.com/office/word/2012/wordml" xmlns:w16cex="http://schemas.microsoft.com/office/word/2018/wordml/cex" xmlns:w16cid="http://schemas.microsoft.com/office/word/2016/wordml/cid" xmlns:w16="http://schemas.microsoft.com/office/word/2018/wordml" xmlns:w16sdtdh="http://schemas.microsoft.com/office/word/2020/wordml/sdtdatahash" xmlns:w16sdtfl="http://schemas.microsoft.com/office/word/2024/wordml/sdtformatlock" xmlns:w16se="http://schemas.microsoft.com/office/word/2015/wordml/symex" xmlns:w16du="http://schemas.microsoft.com/office/word/2023/wordml/word16du" xmlns:wne="http://schemas.microsoft.com/office/word/2006/wordml" mc:Ignorable="w14 w15 w16se w16cid w16 w16cex w16sdtdh w16sdtfl w16du wp14">
+<w:numbering xmlns:wpc="http://schemas.microsoft.com/office/word/2010/wordprocessingCanvas" xmlns:cx="http://schemas.microsoft.com/office/drawing/2014/chartex" xmlns:cx1="http://schemas.microsoft.com/office/drawing/2015/9/8/chartex" xmlns:cx2="http://schemas.microsoft.com/office/drawing/2015/10/21/chartex" xmlns:cx3="http://schemas.microsoft.com/office/drawing/2016/5/9/chartex" xmlns:cx4="http://schemas.microsoft.com/office/drawing/2016/5/10/chartex" xmlns:cx5="http://schemas.microsoft.com/office/drawing/2016/5/11/chartex" xmlns:cx6="http://schemas.microsoft.com/office/drawing/2016/5/12/chartex" xmlns:cx7="http://schemas.microsoft.com/office/drawing/2016/5/13/chartex" xmlns:cx8="http://schemas.microsoft.com/office/drawing/2016/5/14/chartex" xmlns:mc="http://schemas.openxmlformats.org/markup-compatibility/2006" xmlns:aink="http://schemas.microsoft.com/office/drawing/2016/ink" xmlns:am3d="http://schemas.microsoft.com/office/drawing/2017/model3d" xmlns:o="urn:schemas-microsoft-com:office:office" xmlns:oel="http://schemas.microsoft.com/office/2019/extlst" xmlns:r="http://schemas.openxmlformats.org/officeDocument/2006/relationships" xmlns:m="http://schemas.openxmlformats.org/officeDocument/2006/math" xmlns:v="urn:schemas-microsoft-com:vml" xmlns:wp14="http://schemas.microsoft.com/office/word/2010/wordprocessingDrawing" xmlns:wp="http://schemas.openxmlformats.org/drawingml/2006/wordprocessingDrawing" xmlns:w10="urn:schemas-microsoft-com:office:word" xmlns:w="http://schemas.openxmlformats.org/wordprocessingml/2006/main" xmlns:w14="http://schemas.microsoft.com/office/word/2010/wordml" xmlns:w15="http://schemas.microsoft.com/office/word/2012/wordml" xmlns:w16cex="http://schemas.microsoft.com/office/word/2018/wordml/cex" xmlns:w16cid="http://schemas.microsoft.com/office/word/2016/wordml/cid" xmlns:w16="http://schemas.microsoft.com/office/word/2018/wordml" xmlns:w16du="http://schemas.microsoft.com/office/word/2023/wordml/word16du" xmlns:w16sdtdh="http://schemas.microsoft.com/office/word/2020/wordml/sdtdatahash" xmlns:w16sdtfl="http://schemas.microsoft.com/office/word/2024/wordml/sdtformatlock" xmlns:w16se="http://schemas.microsoft.com/office/word/2015/wordml/symex" xmlns:wpg="http://schemas.microsoft.com/office/word/2010/wordprocessingGroup" xmlns:wpi="http://schemas.microsoft.com/office/word/2010/wordprocessingInk" xmlns:wne="http://schemas.microsoft.com/office/word/2006/wordml" xmlns:wps="http://schemas.microsoft.com/office/word/2010/wordprocessingShape" mc:Ignorable="w14 w15 w16se w16cid w16 w16cex w16sdtdh w16sdtfl w16du wp14">
   <w:abstractNum w:abstractNumId="0" w15:restartNumberingAfterBreak="0">
     <w:nsid w:val="05693D04"/>
     <w:multiLevelType w:val="multilevel"/>
@@ -8069,6 +8322,119 @@
     </w:lvl>
   </w:abstractNum>
   <w:abstractNum w:abstractNumId="22" w15:restartNumberingAfterBreak="0">
+    <w:nsid w:val="70745954"/>
+    <w:multiLevelType w:val="hybridMultilevel"/>
+    <w:tmpl w:val="1F90590E"/>
+    <w:lvl w:ilvl="0" w:tplc="2000000F">
+      <w:start w:val="1"/>
+      <w:numFmt w:val="decimal"/>
+      <w:lvlText w:val="%1."/>
+      <w:lvlJc w:val="left"/>
+      <w:pPr>
+        <w:ind w:left="720" w:hanging="360"/>
+      </w:pPr>
+      <w:rPr>
+        <w:rFonts w:hint="default"/>
+      </w:rPr>
+    </w:lvl>
+    <w:lvl w:ilvl="1" w:tplc="FFFFFFFF" w:tentative="1">
+      <w:start w:val="1"/>
+      <w:numFmt w:val="bullet"/>
+      <w:lvlText w:val="o"/>
+      <w:lvlJc w:val="left"/>
+      <w:pPr>
+        <w:ind w:left="1440" w:hanging="360"/>
+      </w:pPr>
+      <w:rPr>
+        <w:rFonts w:ascii="Courier New" w:hAnsi="Courier New" w:cs="Courier New" w:hint="default"/>
+      </w:rPr>
+    </w:lvl>
+    <w:lvl w:ilvl="2" w:tplc="FFFFFFFF" w:tentative="1">
+      <w:start w:val="1"/>
+      <w:numFmt w:val="bullet"/>
+      <w:lvlText w:val=""/>
+      <w:lvlJc w:val="left"/>
+      <w:pPr>
+        <w:ind w:left="2160" w:hanging="360"/>
+      </w:pPr>
+      <w:rPr>
+        <w:rFonts w:ascii="Wingdings" w:hAnsi="Wingdings" w:hint="default"/>
+      </w:rPr>
+    </w:lvl>
+    <w:lvl w:ilvl="3" w:tplc="FFFFFFFF" w:tentative="1">
+      <w:start w:val="1"/>
+      <w:numFmt w:val="bullet"/>
+      <w:lvlText w:val=""/>
+      <w:lvlJc w:val="left"/>
+      <w:pPr>
+        <w:ind w:left="2880" w:hanging="360"/>
+      </w:pPr>
+      <w:rPr>
+        <w:rFonts w:ascii="Symbol" w:hAnsi="Symbol" w:hint="default"/>
+      </w:rPr>
+    </w:lvl>
+    <w:lvl w:ilvl="4" w:tplc="FFFFFFFF" w:tentative="1">
+      <w:start w:val="1"/>
+      <w:numFmt w:val="bullet"/>
+      <w:lvlText w:val="o"/>
+      <w:lvlJc w:val="left"/>
+      <w:pPr>
+        <w:ind w:left="3600" w:hanging="360"/>
+      </w:pPr>
+      <w:rPr>
+        <w:rFonts w:ascii="Courier New" w:hAnsi="Courier New" w:cs="Courier New" w:hint="default"/>
+      </w:rPr>
+    </w:lvl>
+    <w:lvl w:ilvl="5" w:tplc="FFFFFFFF" w:tentative="1">
+      <w:start w:val="1"/>
+      <w:numFmt w:val="bullet"/>
+      <w:lvlText w:val=""/>
+      <w:lvlJc w:val="left"/>
+      <w:pPr>
+        <w:ind w:left="4320" w:hanging="360"/>
+      </w:pPr>
+      <w:rPr>
+        <w:rFonts w:ascii="Wingdings" w:hAnsi="Wingdings" w:hint="default"/>
+      </w:rPr>
+    </w:lvl>
+    <w:lvl w:ilvl="6" w:tplc="FFFFFFFF" w:tentative="1">
+      <w:start w:val="1"/>
+      <w:numFmt w:val="bullet"/>
+      <w:lvlText w:val=""/>
+      <w:lvlJc w:val="left"/>
+      <w:pPr>
+        <w:ind w:left="5040" w:hanging="360"/>
+      </w:pPr>
+      <w:rPr>
+        <w:rFonts w:ascii="Symbol" w:hAnsi="Symbol" w:hint="default"/>
+      </w:rPr>
+    </w:lvl>
+    <w:lvl w:ilvl="7" w:tplc="FFFFFFFF" w:tentative="1">
+      <w:start w:val="1"/>
+      <w:numFmt w:val="bullet"/>
+      <w:lvlText w:val="o"/>
+      <w:lvlJc w:val="left"/>
+      <w:pPr>
+        <w:ind w:left="5760" w:hanging="360"/>
+      </w:pPr>
+      <w:rPr>
+        <w:rFonts w:ascii="Courier New" w:hAnsi="Courier New" w:cs="Courier New" w:hint="default"/>
+      </w:rPr>
+    </w:lvl>
+    <w:lvl w:ilvl="8" w:tplc="FFFFFFFF" w:tentative="1">
+      <w:start w:val="1"/>
+      <w:numFmt w:val="bullet"/>
+      <w:lvlText w:val=""/>
+      <w:lvlJc w:val="left"/>
+      <w:pPr>
+        <w:ind w:left="6480" w:hanging="360"/>
+      </w:pPr>
+      <w:rPr>
+        <w:rFonts w:ascii="Wingdings" w:hAnsi="Wingdings" w:hint="default"/>
+      </w:rPr>
+    </w:lvl>
+  </w:abstractNum>
+  <w:abstractNum w:abstractNumId="23" w15:restartNumberingAfterBreak="0">
     <w:nsid w:val="71923E58"/>
     <w:multiLevelType w:val="multilevel"/>
     <w:tmpl w:val="117E6A32"/>
@@ -8217,7 +8583,7 @@
       </w:rPr>
     </w:lvl>
   </w:abstractNum>
-  <w:abstractNum w:abstractNumId="23" w15:restartNumberingAfterBreak="0">
+  <w:abstractNum w:abstractNumId="24" w15:restartNumberingAfterBreak="0">
     <w:nsid w:val="74430EA6"/>
     <w:multiLevelType w:val="multilevel"/>
     <w:tmpl w:val="5756D390"/>
@@ -8366,7 +8732,7 @@
       </w:rPr>
     </w:lvl>
   </w:abstractNum>
-  <w:abstractNum w:abstractNumId="24" w15:restartNumberingAfterBreak="0">
+  <w:abstractNum w:abstractNumId="25" w15:restartNumberingAfterBreak="0">
     <w:nsid w:val="78592F84"/>
     <w:multiLevelType w:val="multilevel"/>
     <w:tmpl w:val="2BE07A6E"/>
@@ -8515,7 +8881,7 @@
       </w:rPr>
     </w:lvl>
   </w:abstractNum>
-  <w:abstractNum w:abstractNumId="25" w15:restartNumberingAfterBreak="0">
+  <w:abstractNum w:abstractNumId="26" w15:restartNumberingAfterBreak="0">
     <w:nsid w:val="7DC677A5"/>
     <w:multiLevelType w:val="multilevel"/>
     <w:tmpl w:val="9B42BDD0"/>
@@ -8689,13 +9055,13 @@
     <w:abstractNumId w:val="5"/>
   </w:num>
   <w:num w:numId="9" w16cid:durableId="1984890119">
-    <w:abstractNumId w:val="23"/>
+    <w:abstractNumId w:val="24"/>
   </w:num>
   <w:num w:numId="10" w16cid:durableId="2137605144">
     <w:abstractNumId w:val="8"/>
   </w:num>
   <w:num w:numId="11" w16cid:durableId="1200708041">
-    <w:abstractNumId w:val="25"/>
+    <w:abstractNumId w:val="26"/>
   </w:num>
   <w:num w:numId="12" w16cid:durableId="732044217">
     <w:abstractNumId w:val="18"/>
@@ -8719,13 +9085,13 @@
     <w:abstractNumId w:val="2"/>
   </w:num>
   <w:num w:numId="19" w16cid:durableId="921182255">
-    <w:abstractNumId w:val="22"/>
+    <w:abstractNumId w:val="23"/>
   </w:num>
   <w:num w:numId="20" w16cid:durableId="1187020190">
     <w:abstractNumId w:val="21"/>
   </w:num>
   <w:num w:numId="21" w16cid:durableId="614681544">
-    <w:abstractNumId w:val="24"/>
+    <w:abstractNumId w:val="25"/>
   </w:num>
   <w:num w:numId="22" w16cid:durableId="2078243239">
     <w:abstractNumId w:val="1"/>
@@ -8742,11 +9108,14 @@
   <w:num w:numId="26" w16cid:durableId="355156544">
     <w:abstractNumId w:val="9"/>
   </w:num>
+  <w:num w:numId="27" w16cid:durableId="832643494">
+    <w:abstractNumId w:val="22"/>
+  </w:num>
 </w:numbering>
 </file>
 
 <file path=word/styles.xml><?xml version="1.0" encoding="utf-8"?>
-<w:styles xmlns:mc="http://schemas.openxmlformats.org/markup-compatibility/2006" xmlns:r="http://schemas.openxmlformats.org/officeDocument/2006/relationships" xmlns:w="http://schemas.openxmlformats.org/wordprocessingml/2006/main" xmlns:w14="http://schemas.microsoft.com/office/word/2010/wordml" xmlns:w15="http://schemas.microsoft.com/office/word/2012/wordml" xmlns:w16cex="http://schemas.microsoft.com/office/word/2018/wordml/cex" xmlns:w16cid="http://schemas.microsoft.com/office/word/2016/wordml/cid" xmlns:w16="http://schemas.microsoft.com/office/word/2018/wordml" xmlns:w16sdtdh="http://schemas.microsoft.com/office/word/2020/wordml/sdtdatahash" xmlns:w16sdtfl="http://schemas.microsoft.com/office/word/2024/wordml/sdtformatlock" xmlns:w16se="http://schemas.microsoft.com/office/word/2015/wordml/symex" xmlns:w16du="http://schemas.microsoft.com/office/word/2023/wordml/word16du" mc:Ignorable="w14 w15 w16se w16cid w16 w16cex w16sdtdh w16sdtfl w16du">
+<w:styles xmlns:mc="http://schemas.openxmlformats.org/markup-compatibility/2006" xmlns:r="http://schemas.openxmlformats.org/officeDocument/2006/relationships" xmlns:w="http://schemas.openxmlformats.org/wordprocessingml/2006/main" xmlns:w14="http://schemas.microsoft.com/office/word/2010/wordml" xmlns:w15="http://schemas.microsoft.com/office/word/2012/wordml" xmlns:w16cex="http://schemas.microsoft.com/office/word/2018/wordml/cex" xmlns:w16cid="http://schemas.microsoft.com/office/word/2016/wordml/cid" xmlns:w16="http://schemas.microsoft.com/office/word/2018/wordml" xmlns:w16du="http://schemas.microsoft.com/office/word/2023/wordml/word16du" xmlns:w16sdtdh="http://schemas.microsoft.com/office/word/2020/wordml/sdtdatahash" xmlns:w16sdtfl="http://schemas.microsoft.com/office/word/2024/wordml/sdtformatlock" xmlns:w16se="http://schemas.microsoft.com/office/word/2015/wordml/symex" mc:Ignorable="w14 w15 w16se w16cid w16 w16cex w16sdtdh w16sdtfl w16du">
   <w:docDefaults>
     <w:rPrDefault>
       <w:rPr>
@@ -9138,7 +9507,7 @@
     <w:lsdException w:name="Unresolved Mention" w:semiHidden="1" w:unhideWhenUsed="1"/>
     <w:lsdException w:name="Smart Link" w:semiHidden="1" w:unhideWhenUsed="1"/>
   </w:latentStyles>
-  <w:style w:type="paragraph" w:default="1" w:styleId="Standaard">
+  <w:style w:type="paragraph" w:default="1" w:styleId="Normal">
     <w:name w:val="Normal"/>
     <w:qFormat/>
     <w:rsid w:val="00D268F5"/>
@@ -9149,11 +9518,11 @@
       <w14:ligatures w14:val="none"/>
     </w:rPr>
   </w:style>
-  <w:style w:type="paragraph" w:styleId="Kop1">
+  <w:style w:type="paragraph" w:styleId="Heading1">
     <w:name w:val="heading 1"/>
-    <w:basedOn w:val="Standaard"/>
-    <w:next w:val="Standaard"/>
-    <w:link w:val="Kop1Char"/>
+    <w:basedOn w:val="Normal"/>
+    <w:next w:val="Normal"/>
+    <w:link w:val="Heading1Char"/>
     <w:uiPriority w:val="9"/>
     <w:qFormat/>
     <w:rsid w:val="00F17B7E"/>
@@ -9170,11 +9539,11 @@
       <w:szCs w:val="40"/>
     </w:rPr>
   </w:style>
-  <w:style w:type="paragraph" w:styleId="Kop2">
+  <w:style w:type="paragraph" w:styleId="Heading2">
     <w:name w:val="heading 2"/>
-    <w:basedOn w:val="Standaard"/>
-    <w:next w:val="Standaard"/>
-    <w:link w:val="Kop2Char"/>
+    <w:basedOn w:val="Normal"/>
+    <w:next w:val="Normal"/>
+    <w:link w:val="Heading2Char"/>
     <w:uiPriority w:val="9"/>
     <w:semiHidden/>
     <w:unhideWhenUsed/>
@@ -9193,11 +9562,11 @@
       <w:szCs w:val="32"/>
     </w:rPr>
   </w:style>
-  <w:style w:type="paragraph" w:styleId="Kop3">
+  <w:style w:type="paragraph" w:styleId="Heading3">
     <w:name w:val="heading 3"/>
-    <w:basedOn w:val="Standaard"/>
-    <w:next w:val="Standaard"/>
-    <w:link w:val="Kop3Char"/>
+    <w:basedOn w:val="Normal"/>
+    <w:next w:val="Normal"/>
+    <w:link w:val="Heading3Char"/>
     <w:uiPriority w:val="9"/>
     <w:unhideWhenUsed/>
     <w:qFormat/>
@@ -9215,11 +9584,11 @@
       <w:szCs w:val="28"/>
     </w:rPr>
   </w:style>
-  <w:style w:type="paragraph" w:styleId="Kop4">
+  <w:style w:type="paragraph" w:styleId="Heading4">
     <w:name w:val="heading 4"/>
-    <w:basedOn w:val="Standaard"/>
-    <w:next w:val="Standaard"/>
-    <w:link w:val="Kop4Char"/>
+    <w:basedOn w:val="Normal"/>
+    <w:next w:val="Normal"/>
+    <w:link w:val="Heading4Char"/>
     <w:uiPriority w:val="9"/>
     <w:semiHidden/>
     <w:unhideWhenUsed/>
@@ -9238,11 +9607,11 @@
       <w:color w:val="0F4761" w:themeColor="accent1" w:themeShade="BF"/>
     </w:rPr>
   </w:style>
-  <w:style w:type="paragraph" w:styleId="Kop5">
+  <w:style w:type="paragraph" w:styleId="Heading5">
     <w:name w:val="heading 5"/>
-    <w:basedOn w:val="Standaard"/>
-    <w:next w:val="Standaard"/>
-    <w:link w:val="Kop5Char"/>
+    <w:basedOn w:val="Normal"/>
+    <w:next w:val="Normal"/>
+    <w:link w:val="Heading5Char"/>
     <w:uiPriority w:val="9"/>
     <w:semiHidden/>
     <w:unhideWhenUsed/>
@@ -9259,11 +9628,11 @@
       <w:color w:val="0F4761" w:themeColor="accent1" w:themeShade="BF"/>
     </w:rPr>
   </w:style>
-  <w:style w:type="paragraph" w:styleId="Kop6">
+  <w:style w:type="paragraph" w:styleId="Heading6">
     <w:name w:val="heading 6"/>
-    <w:basedOn w:val="Standaard"/>
-    <w:next w:val="Standaard"/>
-    <w:link w:val="Kop6Char"/>
+    <w:basedOn w:val="Normal"/>
+    <w:next w:val="Normal"/>
+    <w:link w:val="Heading6Char"/>
     <w:uiPriority w:val="9"/>
     <w:semiHidden/>
     <w:unhideWhenUsed/>
@@ -9282,11 +9651,11 @@
       <w:color w:val="595959" w:themeColor="text1" w:themeTint="A6"/>
     </w:rPr>
   </w:style>
-  <w:style w:type="paragraph" w:styleId="Kop7">
+  <w:style w:type="paragraph" w:styleId="Heading7">
     <w:name w:val="heading 7"/>
-    <w:basedOn w:val="Standaard"/>
-    <w:next w:val="Standaard"/>
-    <w:link w:val="Kop7Char"/>
+    <w:basedOn w:val="Normal"/>
+    <w:next w:val="Normal"/>
+    <w:link w:val="Heading7Char"/>
     <w:uiPriority w:val="9"/>
     <w:semiHidden/>
     <w:unhideWhenUsed/>
@@ -9303,11 +9672,11 @@
       <w:color w:val="595959" w:themeColor="text1" w:themeTint="A6"/>
     </w:rPr>
   </w:style>
-  <w:style w:type="paragraph" w:styleId="Kop8">
+  <w:style w:type="paragraph" w:styleId="Heading8">
     <w:name w:val="heading 8"/>
-    <w:basedOn w:val="Standaard"/>
-    <w:next w:val="Standaard"/>
-    <w:link w:val="Kop8Char"/>
+    <w:basedOn w:val="Normal"/>
+    <w:next w:val="Normal"/>
+    <w:link w:val="Heading8Char"/>
     <w:uiPriority w:val="9"/>
     <w:semiHidden/>
     <w:unhideWhenUsed/>
@@ -9325,11 +9694,11 @@
       <w:color w:val="272727" w:themeColor="text1" w:themeTint="D8"/>
     </w:rPr>
   </w:style>
-  <w:style w:type="paragraph" w:styleId="Kop9">
+  <w:style w:type="paragraph" w:styleId="Heading9">
     <w:name w:val="heading 9"/>
-    <w:basedOn w:val="Standaard"/>
-    <w:next w:val="Standaard"/>
-    <w:link w:val="Kop9Char"/>
+    <w:basedOn w:val="Normal"/>
+    <w:next w:val="Normal"/>
+    <w:link w:val="Heading9Char"/>
     <w:uiPriority w:val="9"/>
     <w:semiHidden/>
     <w:unhideWhenUsed/>
@@ -9345,13 +9714,13 @@
       <w:color w:val="272727" w:themeColor="text1" w:themeTint="D8"/>
     </w:rPr>
   </w:style>
-  <w:style w:type="character" w:default="1" w:styleId="Standaardalinea-lettertype">
+  <w:style w:type="character" w:default="1" w:styleId="DefaultParagraphFont">
     <w:name w:val="Default Paragraph Font"/>
     <w:uiPriority w:val="1"/>
     <w:semiHidden/>
     <w:unhideWhenUsed/>
   </w:style>
-  <w:style w:type="table" w:default="1" w:styleId="Standaardtabel">
+  <w:style w:type="table" w:default="1" w:styleId="TableNormal">
     <w:name w:val="Normal Table"/>
     <w:uiPriority w:val="99"/>
     <w:semiHidden/>
@@ -9366,16 +9735,16 @@
       </w:tblCellMar>
     </w:tblPr>
   </w:style>
-  <w:style w:type="numbering" w:default="1" w:styleId="Geenlijst">
+  <w:style w:type="numbering" w:default="1" w:styleId="NoList">
     <w:name w:val="No List"/>
     <w:uiPriority w:val="99"/>
     <w:semiHidden/>
     <w:unhideWhenUsed/>
   </w:style>
-  <w:style w:type="character" w:customStyle="1" w:styleId="Kop1Char">
-    <w:name w:val="Kop 1 Char"/>
-    <w:basedOn w:val="Standaardalinea-lettertype"/>
-    <w:link w:val="Kop1"/>
+  <w:style w:type="character" w:customStyle="1" w:styleId="Heading1Char">
+    <w:name w:val="Heading 1 Char"/>
+    <w:basedOn w:val="DefaultParagraphFont"/>
+    <w:link w:val="Heading1"/>
     <w:uiPriority w:val="9"/>
     <w:rsid w:val="00F17B7E"/>
     <w:rPr>
@@ -9385,10 +9754,10 @@
       <w:szCs w:val="40"/>
     </w:rPr>
   </w:style>
-  <w:style w:type="character" w:customStyle="1" w:styleId="Kop2Char">
-    <w:name w:val="Kop 2 Char"/>
-    <w:basedOn w:val="Standaardalinea-lettertype"/>
-    <w:link w:val="Kop2"/>
+  <w:style w:type="character" w:customStyle="1" w:styleId="Heading2Char">
+    <w:name w:val="Heading 2 Char"/>
+    <w:basedOn w:val="DefaultParagraphFont"/>
+    <w:link w:val="Heading2"/>
     <w:uiPriority w:val="9"/>
     <w:semiHidden/>
     <w:rsid w:val="00F17B7E"/>
@@ -9399,10 +9768,10 @@
       <w:szCs w:val="32"/>
     </w:rPr>
   </w:style>
-  <w:style w:type="character" w:customStyle="1" w:styleId="Kop3Char">
-    <w:name w:val="Kop 3 Char"/>
-    <w:basedOn w:val="Standaardalinea-lettertype"/>
-    <w:link w:val="Kop3"/>
+  <w:style w:type="character" w:customStyle="1" w:styleId="Heading3Char">
+    <w:name w:val="Heading 3 Char"/>
+    <w:basedOn w:val="DefaultParagraphFont"/>
+    <w:link w:val="Heading3"/>
     <w:uiPriority w:val="9"/>
     <w:rsid w:val="00F17B7E"/>
     <w:rPr>
@@ -9412,10 +9781,10 @@
       <w:szCs w:val="28"/>
     </w:rPr>
   </w:style>
-  <w:style w:type="character" w:customStyle="1" w:styleId="Kop4Char">
-    <w:name w:val="Kop 4 Char"/>
-    <w:basedOn w:val="Standaardalinea-lettertype"/>
-    <w:link w:val="Kop4"/>
+  <w:style w:type="character" w:customStyle="1" w:styleId="Heading4Char">
+    <w:name w:val="Heading 4 Char"/>
+    <w:basedOn w:val="DefaultParagraphFont"/>
+    <w:link w:val="Heading4"/>
     <w:uiPriority w:val="9"/>
     <w:semiHidden/>
     <w:rsid w:val="00F17B7E"/>
@@ -9426,10 +9795,10 @@
       <w:color w:val="0F4761" w:themeColor="accent1" w:themeShade="BF"/>
     </w:rPr>
   </w:style>
-  <w:style w:type="character" w:customStyle="1" w:styleId="Kop5Char">
-    <w:name w:val="Kop 5 Char"/>
-    <w:basedOn w:val="Standaardalinea-lettertype"/>
-    <w:link w:val="Kop5"/>
+  <w:style w:type="character" w:customStyle="1" w:styleId="Heading5Char">
+    <w:name w:val="Heading 5 Char"/>
+    <w:basedOn w:val="DefaultParagraphFont"/>
+    <w:link w:val="Heading5"/>
     <w:uiPriority w:val="9"/>
     <w:semiHidden/>
     <w:rsid w:val="00F17B7E"/>
@@ -9438,10 +9807,10 @@
       <w:color w:val="0F4761" w:themeColor="accent1" w:themeShade="BF"/>
     </w:rPr>
   </w:style>
-  <w:style w:type="character" w:customStyle="1" w:styleId="Kop6Char">
-    <w:name w:val="Kop 6 Char"/>
-    <w:basedOn w:val="Standaardalinea-lettertype"/>
-    <w:link w:val="Kop6"/>
+  <w:style w:type="character" w:customStyle="1" w:styleId="Heading6Char">
+    <w:name w:val="Heading 6 Char"/>
+    <w:basedOn w:val="DefaultParagraphFont"/>
+    <w:link w:val="Heading6"/>
     <w:uiPriority w:val="9"/>
     <w:semiHidden/>
     <w:rsid w:val="00F17B7E"/>
@@ -9452,10 +9821,10 @@
       <w:color w:val="595959" w:themeColor="text1" w:themeTint="A6"/>
     </w:rPr>
   </w:style>
-  <w:style w:type="character" w:customStyle="1" w:styleId="Kop7Char">
-    <w:name w:val="Kop 7 Char"/>
-    <w:basedOn w:val="Standaardalinea-lettertype"/>
-    <w:link w:val="Kop7"/>
+  <w:style w:type="character" w:customStyle="1" w:styleId="Heading7Char">
+    <w:name w:val="Heading 7 Char"/>
+    <w:basedOn w:val="DefaultParagraphFont"/>
+    <w:link w:val="Heading7"/>
     <w:uiPriority w:val="9"/>
     <w:semiHidden/>
     <w:rsid w:val="00F17B7E"/>
@@ -9464,10 +9833,10 @@
       <w:color w:val="595959" w:themeColor="text1" w:themeTint="A6"/>
     </w:rPr>
   </w:style>
-  <w:style w:type="character" w:customStyle="1" w:styleId="Kop8Char">
-    <w:name w:val="Kop 8 Char"/>
-    <w:basedOn w:val="Standaardalinea-lettertype"/>
-    <w:link w:val="Kop8"/>
+  <w:style w:type="character" w:customStyle="1" w:styleId="Heading8Char">
+    <w:name w:val="Heading 8 Char"/>
+    <w:basedOn w:val="DefaultParagraphFont"/>
+    <w:link w:val="Heading8"/>
     <w:uiPriority w:val="9"/>
     <w:semiHidden/>
     <w:rsid w:val="00F17B7E"/>
@@ -9478,10 +9847,10 @@
       <w:color w:val="272727" w:themeColor="text1" w:themeTint="D8"/>
     </w:rPr>
   </w:style>
-  <w:style w:type="character" w:customStyle="1" w:styleId="Kop9Char">
-    <w:name w:val="Kop 9 Char"/>
-    <w:basedOn w:val="Standaardalinea-lettertype"/>
-    <w:link w:val="Kop9"/>
+  <w:style w:type="character" w:customStyle="1" w:styleId="Heading9Char">
+    <w:name w:val="Heading 9 Char"/>
+    <w:basedOn w:val="DefaultParagraphFont"/>
+    <w:link w:val="Heading9"/>
     <w:uiPriority w:val="9"/>
     <w:semiHidden/>
     <w:rsid w:val="00F17B7E"/>
@@ -9490,11 +9859,11 @@
       <w:color w:val="272727" w:themeColor="text1" w:themeTint="D8"/>
     </w:rPr>
   </w:style>
-  <w:style w:type="paragraph" w:styleId="Titel">
+  <w:style w:type="paragraph" w:styleId="Title">
     <w:name w:val="Title"/>
-    <w:basedOn w:val="Standaard"/>
-    <w:next w:val="Standaard"/>
-    <w:link w:val="TitelChar"/>
+    <w:basedOn w:val="Normal"/>
+    <w:next w:val="Normal"/>
+    <w:link w:val="TitleChar"/>
     <w:uiPriority w:val="10"/>
     <w:qFormat/>
     <w:rsid w:val="00F17B7E"/>
@@ -9510,10 +9879,10 @@
       <w:szCs w:val="56"/>
     </w:rPr>
   </w:style>
-  <w:style w:type="character" w:customStyle="1" w:styleId="TitelChar">
-    <w:name w:val="Titel Char"/>
-    <w:basedOn w:val="Standaardalinea-lettertype"/>
-    <w:link w:val="Titel"/>
+  <w:style w:type="character" w:customStyle="1" w:styleId="TitleChar">
+    <w:name w:val="Title Char"/>
+    <w:basedOn w:val="DefaultParagraphFont"/>
+    <w:link w:val="Title"/>
     <w:uiPriority w:val="10"/>
     <w:rsid w:val="00F17B7E"/>
     <w:rPr>
@@ -9524,11 +9893,11 @@
       <w:szCs w:val="56"/>
     </w:rPr>
   </w:style>
-  <w:style w:type="paragraph" w:styleId="Ondertitel">
+  <w:style w:type="paragraph" w:styleId="Subtitle">
     <w:name w:val="Subtitle"/>
-    <w:basedOn w:val="Standaard"/>
-    <w:next w:val="Standaard"/>
-    <w:link w:val="OndertitelChar"/>
+    <w:basedOn w:val="Normal"/>
+    <w:next w:val="Normal"/>
+    <w:link w:val="SubtitleChar"/>
     <w:uiPriority w:val="11"/>
     <w:qFormat/>
     <w:rsid w:val="00F17B7E"/>
@@ -9546,10 +9915,10 @@
       <w:szCs w:val="28"/>
     </w:rPr>
   </w:style>
-  <w:style w:type="character" w:customStyle="1" w:styleId="OndertitelChar">
-    <w:name w:val="Ondertitel Char"/>
-    <w:basedOn w:val="Standaardalinea-lettertype"/>
-    <w:link w:val="Ondertitel"/>
+  <w:style w:type="character" w:customStyle="1" w:styleId="SubtitleChar">
+    <w:name w:val="Subtitle Char"/>
+    <w:basedOn w:val="DefaultParagraphFont"/>
+    <w:link w:val="Subtitle"/>
     <w:uiPriority w:val="11"/>
     <w:rsid w:val="00F17B7E"/>
     <w:rPr>
@@ -9560,11 +9929,11 @@
       <w:szCs w:val="28"/>
     </w:rPr>
   </w:style>
-  <w:style w:type="paragraph" w:styleId="Citaat">
+  <w:style w:type="paragraph" w:styleId="Quote">
     <w:name w:val="Quote"/>
-    <w:basedOn w:val="Standaard"/>
-    <w:next w:val="Standaard"/>
-    <w:link w:val="CitaatChar"/>
+    <w:basedOn w:val="Normal"/>
+    <w:next w:val="Normal"/>
+    <w:link w:val="QuoteChar"/>
     <w:uiPriority w:val="29"/>
     <w:qFormat/>
     <w:rsid w:val="00F17B7E"/>
@@ -9578,10 +9947,10 @@
       <w:color w:val="404040" w:themeColor="text1" w:themeTint="BF"/>
     </w:rPr>
   </w:style>
-  <w:style w:type="character" w:customStyle="1" w:styleId="CitaatChar">
-    <w:name w:val="Citaat Char"/>
-    <w:basedOn w:val="Standaardalinea-lettertype"/>
-    <w:link w:val="Citaat"/>
+  <w:style w:type="character" w:customStyle="1" w:styleId="QuoteChar">
+    <w:name w:val="Quote Char"/>
+    <w:basedOn w:val="DefaultParagraphFont"/>
+    <w:link w:val="Quote"/>
     <w:uiPriority w:val="29"/>
     <w:rsid w:val="00F17B7E"/>
     <w:rPr>
@@ -9590,9 +9959,9 @@
       <w:color w:val="404040" w:themeColor="text1" w:themeTint="BF"/>
     </w:rPr>
   </w:style>
-  <w:style w:type="paragraph" w:styleId="Lijstalinea">
+  <w:style w:type="paragraph" w:styleId="ListParagraph">
     <w:name w:val="List Paragraph"/>
-    <w:basedOn w:val="Standaard"/>
+    <w:basedOn w:val="Normal"/>
     <w:uiPriority w:val="34"/>
     <w:qFormat/>
     <w:rsid w:val="00F17B7E"/>
@@ -9601,9 +9970,9 @@
       <w:contextualSpacing/>
     </w:pPr>
   </w:style>
-  <w:style w:type="character" w:styleId="Intensievebenadrukking">
+  <w:style w:type="character" w:styleId="IntenseEmphasis">
     <w:name w:val="Intense Emphasis"/>
-    <w:basedOn w:val="Standaardalinea-lettertype"/>
+    <w:basedOn w:val="DefaultParagraphFont"/>
     <w:uiPriority w:val="21"/>
     <w:qFormat/>
     <w:rsid w:val="00F17B7E"/>
@@ -9613,11 +9982,11 @@
       <w:color w:val="0F4761" w:themeColor="accent1" w:themeShade="BF"/>
     </w:rPr>
   </w:style>
-  <w:style w:type="paragraph" w:styleId="Duidelijkcitaat">
+  <w:style w:type="paragraph" w:styleId="IntenseQuote">
     <w:name w:val="Intense Quote"/>
-    <w:basedOn w:val="Standaard"/>
-    <w:next w:val="Standaard"/>
-    <w:link w:val="DuidelijkcitaatChar"/>
+    <w:basedOn w:val="Normal"/>
+    <w:next w:val="Normal"/>
+    <w:link w:val="IntenseQuoteChar"/>
     <w:uiPriority w:val="30"/>
     <w:qFormat/>
     <w:rsid w:val="00F17B7E"/>
@@ -9636,10 +10005,10 @@
       <w:color w:val="0F4761" w:themeColor="accent1" w:themeShade="BF"/>
     </w:rPr>
   </w:style>
-  <w:style w:type="character" w:customStyle="1" w:styleId="DuidelijkcitaatChar">
-    <w:name w:val="Duidelijk citaat Char"/>
-    <w:basedOn w:val="Standaardalinea-lettertype"/>
-    <w:link w:val="Duidelijkcitaat"/>
+  <w:style w:type="character" w:customStyle="1" w:styleId="IntenseQuoteChar">
+    <w:name w:val="Intense Quote Char"/>
+    <w:basedOn w:val="DefaultParagraphFont"/>
+    <w:link w:val="IntenseQuote"/>
     <w:uiPriority w:val="30"/>
     <w:rsid w:val="00F17B7E"/>
     <w:rPr>
@@ -9648,9 +10017,9 @@
       <w:color w:val="0F4761" w:themeColor="accent1" w:themeShade="BF"/>
     </w:rPr>
   </w:style>
-  <w:style w:type="character" w:styleId="Intensieveverwijzing">
+  <w:style w:type="character" w:styleId="IntenseReference">
     <w:name w:val="Intense Reference"/>
-    <w:basedOn w:val="Standaardalinea-lettertype"/>
+    <w:basedOn w:val="DefaultParagraphFont"/>
     <w:uiPriority w:val="32"/>
     <w:qFormat/>
     <w:rsid w:val="00F17B7E"/>
@@ -9662,9 +10031,9 @@
       <w:spacing w:val="5"/>
     </w:rPr>
   </w:style>
-  <w:style w:type="paragraph" w:styleId="Normaalweb">
+  <w:style w:type="paragraph" w:styleId="NormalWeb">
     <w:name w:val="Normal (Web)"/>
-    <w:basedOn w:val="Standaard"/>
+    <w:basedOn w:val="Normal"/>
     <w:uiPriority w:val="99"/>
     <w:semiHidden/>
     <w:unhideWhenUsed/>
@@ -9673,9 +10042,9 @@
       <w:spacing w:before="100" w:beforeAutospacing="1" w:after="100" w:afterAutospacing="1"/>
     </w:pPr>
   </w:style>
-  <w:style w:type="character" w:styleId="Zwaar">
+  <w:style w:type="character" w:styleId="Strong">
     <w:name w:val="Strong"/>
-    <w:basedOn w:val="Standaardalinea-lettertype"/>
+    <w:basedOn w:val="DefaultParagraphFont"/>
     <w:uiPriority w:val="22"/>
     <w:qFormat/>
     <w:rsid w:val="00D268F5"/>
@@ -9686,7 +10055,7 @@
   </w:style>
   <w:style w:type="character" w:customStyle="1" w:styleId="apple-converted-space">
     <w:name w:val="apple-converted-space"/>
-    <w:basedOn w:val="Standaardalinea-lettertype"/>
+    <w:basedOn w:val="DefaultParagraphFont"/>
     <w:rsid w:val="00D268F5"/>
   </w:style>
 </w:styles>

</xml_diff>